<commit_message>
fix: considerandos completos nos documentos Word unificados
Corrige extração: dec-considerandos (ol) não estava sendo capturado.
Rota A: 65 arts PII + 44 APIs + 13 considerandos, sem EC 132.
Rota B: 65 arts PII + 44 APIs + 14 considerandos, com Cdo XI (EC 132/2023).
Zero notas consultivas. Verificação automática confirma integridade.

Co-Authored-By: Claude Sonnet 4.6 <noreply@anthropic.com>
</commit_message>
<xml_diff>
--- a/public/pdfs/decreto-unificado-rota-a.docx
+++ b/public/pdfs/decreto-unificado-rota-a.docx
@@ -173,6 +173,162 @@
     </w:p>
     <w:p>
       <w:pPr>
+        <w:ind w:left="709" w:hanging="283"/>
+        <w:spacing w:before="0" w:after="100" w:line="276" w:lineRule="auto"/>
+      </w:pPr>
+      <w:r>
+        <w:rPr>
+          <w:sz w:val="24"/>
+        </w:rPr>
+        <w:t>o disposto no art. 218 da Constituição Federal, que determina ao Estado o dever de promover e incentivar o desenvolvimento científico, a pesquisa, a capacitação científica e tecnológica e a inovação;</w:t>
+      </w:r>
+    </w:p>
+    <w:p>
+      <w:pPr>
+        <w:ind w:left="709" w:hanging="283"/>
+        <w:spacing w:before="0" w:after="100" w:line="276" w:lineRule="auto"/>
+      </w:pPr>
+      <w:r>
+        <w:rPr>
+          <w:sz w:val="24"/>
+        </w:rPr>
+        <w:t>a competência municipal para legislar sobre assuntos de interesse local e suplementar a legislação federal e estadual no que couber, bem como para promover o adequado ordenamento e desenvolvimento local, nos termos do art. 30, I e II, da Constituição Federal, no contexto do arcabouço federativo de ciência, tecnologia e inovação estabelecido no art. 24, IX, da Constituição Federal;</w:t>
+      </w:r>
+    </w:p>
+    <w:p>
+      <w:pPr>
+        <w:ind w:left="709" w:hanging="283"/>
+        <w:spacing w:before="0" w:after="100" w:line="276" w:lineRule="auto"/>
+      </w:pPr>
+      <w:r>
+        <w:rPr>
+          <w:sz w:val="24"/>
+        </w:rPr>
+        <w:t>o alinhamento desta política local com as diretrizes gerais de estímulo à inovação vigentes na ordem jurídica brasileira, preservada a autonomia municipal na definição de seus instrumentos e mecanismos de execução, em especial o Marco Legal de Ciência, Tecnologia e Inovação — Lei Federal nº 10.973, de 2 de dezembro de 2004, com redação dada pela Lei Federal nº 13.243, de 11 de janeiro de 2016 —, que disciplina os instrumentos de fomento à inovação na ordem jurídica nacional, aplicável supletivamente aos programas municipais de CT&amp;I;</w:t>
+      </w:r>
+    </w:p>
+    <w:p>
+      <w:pPr>
+        <w:ind w:left="709" w:hanging="283"/>
+        <w:spacing w:before="0" w:after="100" w:line="276" w:lineRule="auto"/>
+      </w:pPr>
+      <w:r>
+        <w:rPr>
+          <w:sz w:val="24"/>
+        </w:rPr>
+        <w:t>a Lei Municipal nº 7.170, de 19 de dezembro de 2011, que dispõe sobre incentivos à inovação e à pesquisa científica e tecnológica no Município de Joinville, notadamente o disposto em seus arts. 10 (autorização de criação do FIT/Jlle), 13 (formas de concessão de recursos do FIT/Jlle, incluindo subvenção econômica, bolsas, auxílio-pesquisa e participação societária) e 19, §1º (apoio financeiro por subvenção econômica, financiamento ou participação societária, efetuado com recursos do FIT/Jlle), cuja regulamentação integral constitui obrigação do Poder Executivo;</w:t>
+      </w:r>
+    </w:p>
+    <w:p>
+      <w:pPr>
+        <w:ind w:left="709" w:hanging="283"/>
+        <w:spacing w:before="0" w:after="100" w:line="276" w:lineRule="auto"/>
+      </w:pPr>
+      <w:r>
+        <w:rPr>
+          <w:sz w:val="24"/>
+        </w:rPr>
+        <w:t>a Lei Municipal nº 7.190, de 21 de março de 2012, atualmente regido pela Lei Municipal nº 9.538, de 15 de dezembro de 2023, que institui o Conselho Municipal de Ciência, Tecnologia e Inovação (COMCITI), órgão consultivo da política municipal de CT&amp;I, cujo funcionamento interno é disciplinado por Regimento Interno próprio;</w:t>
+      </w:r>
+    </w:p>
+    <w:p>
+      <w:pPr>
+        <w:ind w:left="709" w:hanging="283"/>
+        <w:spacing w:before="0" w:after="100" w:line="276" w:lineRule="auto"/>
+      </w:pPr>
+      <w:r>
+        <w:rPr>
+          <w:sz w:val="24"/>
+        </w:rPr>
+        <w:t>a vocação tecnológica e industrial do Município de Joinville e a importância estratégica da inovação como vetor de desenvolvimento econômico, de geração de emprego qualificado e de diversificação da base produtiva local;</w:t>
+      </w:r>
+    </w:p>
+    <w:p>
+      <w:pPr>
+        <w:ind w:left="709" w:hanging="283"/>
+        <w:spacing w:before="0" w:after="100" w:line="276" w:lineRule="auto"/>
+      </w:pPr>
+      <w:r>
+        <w:rPr>
+          <w:sz w:val="24"/>
+        </w:rPr>
+        <w:t>a necessidade de conferir operacionalidade à política municipal de inovação, mediante instrumento regulamentar que defina proponentes, critérios, governança, fluxo financeiro, prestação de contas, sanções e indicadores de impacto;</w:t>
+      </w:r>
+    </w:p>
+    <w:p>
+      <w:pPr>
+        <w:ind w:left="709" w:hanging="283"/>
+        <w:spacing w:before="0" w:after="100" w:line="276" w:lineRule="auto"/>
+      </w:pPr>
+      <w:r>
+        <w:rPr>
+          <w:sz w:val="24"/>
+        </w:rPr>
+        <w:t>a observância do art. 14 da Lei Complementar nº 101, de 2000 (Lei de Responsabilidade Fiscal), quanto aos requisitos aplicáveis a eventual renúncia de receita, quando aplicável, com a redação atualizada pela Lei Complementar nº 224, de 2025, que introduziu, entre outras providências, a exigência de metas de desempenho objetivas e quantificáveis e a avaliação periódica de resultados, observadas no Capítulo VIII deste Decreto (indicadores de impacto);</w:t>
+      </w:r>
+    </w:p>
+    <w:p>
+      <w:pPr>
+        <w:ind w:left="709" w:hanging="283"/>
+        <w:spacing w:before="0" w:after="100" w:line="276" w:lineRule="auto"/>
+      </w:pPr>
+      <w:r>
+        <w:rPr>
+          <w:sz w:val="24"/>
+        </w:rPr>
+        <w:t>a compatibilidade do objeto deste Decreto com a Lei de Diretrizes Orçamentárias e a Lei Orçamentária Anual vigentes do Município de Joinville, nos termos do art. 16 da Lei Complementar nº 101, de 2000;</w:t>
+      </w:r>
+    </w:p>
+    <w:p>
+      <w:pPr>
+        <w:ind w:left="709" w:hanging="283"/>
+        <w:spacing w:before="0" w:after="100" w:line="276" w:lineRule="auto"/>
+      </w:pPr>
+      <w:r>
+        <w:rPr>
+          <w:sz w:val="24"/>
+        </w:rPr>
+        <w:t>o enquadramento do apoio financeiro autorizado por este Decreto como subvenção econômica de natureza orçamentária, classificada como despesa pública corrente, lastreada em dotação específica da Lei Orçamentária Anual e operada por meio do FIT/Jlle — não configurando renúncia de receita para os fins do art. 14 da Lei de Responsabilidade Fiscal;</w:t>
+      </w:r>
+    </w:p>
+    <w:p>
+      <w:pPr>
+        <w:ind w:left="709" w:hanging="283"/>
+        <w:spacing w:before="0" w:after="100" w:line="276" w:lineRule="auto"/>
+      </w:pPr>
+      <w:r>
+        <w:rPr>
+          <w:sz w:val="24"/>
+        </w:rPr>
+        <w:t>os precedentes municipais brasileiros em matéria de incentivo à inovação, notadamente o modelo de Florianópolis (LC 432/2012, Decreto 17.097/2017 e Portaria SMTTDE 5/2022), adequado à realidade de Joinville;</w:t>
+      </w:r>
+    </w:p>
+    <w:p>
+      <w:pPr>
+        <w:ind w:left="709" w:hanging="283"/>
+        <w:spacing w:before="0" w:after="100" w:line="276" w:lineRule="auto"/>
+      </w:pPr>
+      <w:r>
+        <w:rPr>
+          <w:sz w:val="24"/>
+        </w:rPr>
+        <w:t>a deliberação técnica do Conselho Municipal de Ciência, Tecnologia e Inovação (COMCITI), em parecer exarado na data de ___/___/2026, e a manifestação da Procuradoria-Geral do Município;</w:t>
+      </w:r>
+    </w:p>
+    <w:p>
+      <w:pPr>
+        <w:ind w:left="709" w:hanging="283"/>
+        <w:spacing w:before="0" w:after="100" w:line="276" w:lineRule="auto"/>
+      </w:pPr>
+      <w:r>
+        <w:rPr>
+          <w:sz w:val="24"/>
+        </w:rPr>
+        <w:t>a necessidade de estabelecer indicadores de impacto e rotina de monitoramento, em coerência com os princípios constitucionais da eficiência e da publicidade (art. 37, caput, da Constituição Federal);</w:t>
+      </w:r>
+    </w:p>
+    <w:p>
+      <w:pPr>
         <w:jc w:val="center"/>
         <w:spacing w:before="160" w:after="80"/>
       </w:pPr>
@@ -8275,6 +8431,138 @@
           <w:sz w:val="24"/>
         </w:rPr>
         <w:t>CONSIDERANDO</w:t>
+      </w:r>
+    </w:p>
+    <w:p>
+      <w:pPr>
+        <w:ind w:left="709" w:hanging="283"/>
+        <w:spacing w:before="0" w:after="100" w:line="276" w:lineRule="auto"/>
+      </w:pPr>
+      <w:r>
+        <w:rPr>
+          <w:sz w:val="24"/>
+        </w:rPr>
+        <w:t>o disposto no art. 218 da Constituição Federal, que atribui ao Estado o dever de promover e incentivar o desenvolvimento científico, a pesquisa, a capacitação científica e tecnológica e a inovação, e a competência municipal para legislar sobre assuntos de interesse local, nos termos do art. 30, incisos I e II, da Constituição Federal;</w:t>
+      </w:r>
+    </w:p>
+    <w:p>
+      <w:pPr>
+        <w:ind w:left="709" w:hanging="283"/>
+        <w:spacing w:before="0" w:after="100" w:line="276" w:lineRule="auto"/>
+      </w:pPr>
+      <w:r>
+        <w:rPr>
+          <w:sz w:val="24"/>
+        </w:rPr>
+        <w:t>a Lei Municipal nº 7.170, de 19 de dezembro de 2011, que dispõe sobre medidas de incentivo à inovação e à pesquisa científica e tecnológica no ambiente produtivo e social municipal, notadamente seus instrumentos de apoio a ambientes e ecossistemas de inovação;</w:t>
+      </w:r>
+    </w:p>
+    <w:p>
+      <w:pPr>
+        <w:ind w:left="709" w:hanging="283"/>
+        <w:spacing w:before="0" w:after="100" w:line="276" w:lineRule="auto"/>
+      </w:pPr>
+      <w:r>
+        <w:rPr>
+          <w:sz w:val="24"/>
+        </w:rPr>
+        <w:t>o Decreto Municipal nº ______, de ___ de ________ de 2026, que regulamenta o Programa Municipal de Incentivo à Inovação de Joinville (PII/Jlle), especialmente seus arts. 9º (vinculação obrigatória do Proponente a API credenciado), 14, inciso I (APIs como 1ª camada de governança — filtro e orientação), 17, §2º (vedação de participação dos APIs em avaliação de mérito, homologação e fiscalização financeira) e 17, §3º (delegação a Decreto específico dos requisitos de credenciamento, modelo de parceria e obrigações);</w:t>
+      </w:r>
+    </w:p>
+    <w:p>
+      <w:pPr>
+        <w:ind w:left="709" w:hanging="283"/>
+        <w:spacing w:before="0" w:after="100" w:line="276" w:lineRule="auto"/>
+      </w:pPr>
+      <w:r>
+        <w:rPr>
+          <w:sz w:val="24"/>
+        </w:rPr>
+        <w:t>a Lei Municipal nº 7.190, de 21 de março de 2012, atualmente regido pela Lei Municipal nº 9.538, de 15 de dezembro de 2023, que institui o Conselho Municipal de Ciência, Tecnologia e Inovação (COMCITI), órgão consultivo da política municipal de CT&amp;I, competente para manifestar-se sobre o credenciamento, a avaliação periódica e o descredenciamento dos APIs, conforme seu Regimento Interno;</w:t>
+      </w:r>
+    </w:p>
+    <w:p>
+      <w:pPr>
+        <w:ind w:left="709" w:hanging="283"/>
+        <w:spacing w:before="0" w:after="100" w:line="276" w:lineRule="auto"/>
+      </w:pPr>
+      <w:r>
+        <w:rPr>
+          <w:sz w:val="24"/>
+        </w:rPr>
+        <w:t>o Plano Estratégico de Desenvolvimento Econômico Municipal — PEDEM 2022, elaborado pelo SEBRAE/SC por meio do programa Cidade Empreendedora, em parceria com a Prefeitura Municipal de Joinville, que identificou 5 (cinco) eixos econômicos estratégicos para o desenvolvimento municipal — Cadeias Produtivas; Saúde e Bem-Estar; Turismo, Cultura, Economia Criativa e Colaborativa; Logística; e Inovação Tecnológica — os quais orientam a organização temática dos APIs;</w:t>
+      </w:r>
+    </w:p>
+    <w:p>
+      <w:pPr>
+        <w:ind w:left="709" w:hanging="283"/>
+        <w:spacing w:before="0" w:after="100" w:line="276" w:lineRule="auto"/>
+      </w:pPr>
+      <w:r>
+        <w:rPr>
+          <w:sz w:val="24"/>
+        </w:rPr>
+        <w:t>a necessidade de conferir operacionalidade à primeira camada da governança do Programa, com regras claras de credenciamento, continuidade, avaliação, substituição e descredenciamento das entidades gestoras dos APIs, preservando a estabilidade institucional da política pública e prevenindo descontinuidade operacional;</w:t>
+      </w:r>
+    </w:p>
+    <w:p>
+      <w:pPr>
+        <w:ind w:left="709" w:hanging="283"/>
+        <w:spacing w:before="0" w:after="100" w:line="276" w:lineRule="auto"/>
+      </w:pPr>
+      <w:r>
+        <w:rPr>
+          <w:sz w:val="24"/>
+        </w:rPr>
+        <w:t>a importância de assegurar a separação entre orientação e decisão ao longo de todo o fluxo do Programa, de modo que os APIs atuem como facilitadores da maturação técnica dos Proponentes, sem qualquer ingerência sobre as etapas de avaliação de mérito, de homologação e de fiscalização financeira, que competem à Comissão Técnica, ao Comitê Decisório e à Secretaria gestora, respectivamente;</w:t>
+      </w:r>
+    </w:p>
+    <w:p>
+      <w:pPr>
+        <w:ind w:left="709" w:hanging="283"/>
+        <w:spacing w:before="0" w:after="100" w:line="276" w:lineRule="auto"/>
+      </w:pPr>
+      <w:r>
+        <w:rPr>
+          <w:sz w:val="24"/>
+        </w:rPr>
+        <w:t>os precedentes municipais brasileiros em matéria de organização de Arranjos Promotores de Inovação, notadamente o modelo de Florianópolis — Lei Complementar nº 432, de 2012, Decreto nº 17.097, de 2017 e Portaria SMTTDE nº 5, de 2022 —, cujos elementos operacionais foram adaptados à realidade econômica, à base produtiva e ao arcabouço institucional de Joinville;</w:t>
+      </w:r>
+    </w:p>
+    <w:p>
+      <w:pPr>
+        <w:ind w:left="709" w:hanging="283"/>
+        <w:spacing w:before="0" w:after="100" w:line="276" w:lineRule="auto"/>
+      </w:pPr>
+      <w:r>
+        <w:rPr>
+          <w:sz w:val="24"/>
+        </w:rPr>
+        <w:t>a vocação econômica diversificada do Município de Joinville, que combina forte base industrial metalmecânica, plástica e de borracha; polo regional de saúde e ensino superior; patrimônio cultural e turístico relevante; infraestrutura logística multimodal; e ecossistema consolidado de tecnologia e serviços de informação — configuração que justifica a organização dos APIs por clusters setoriais em vez de arranjo único;</w:t>
+      </w:r>
+    </w:p>
+    <w:p>
+      <w:pPr>
+        <w:ind w:left="709" w:hanging="283"/>
+        <w:spacing w:before="0" w:after="100" w:line="276" w:lineRule="auto"/>
+      </w:pPr>
+      <w:r>
+        <w:rPr>
+          <w:sz w:val="24"/>
+        </w:rPr>
+        <w:t>a observância dos princípios constitucionais da legalidade, da impessoalidade, da moralidade, da publicidade e da eficiência, previstos no art. 37, caput, da Constituição Federal, aplicáveis a todos os atos relativos ao credenciamento, à atuação e ao descredenciamento dos APIs;</w:t>
+      </w:r>
+    </w:p>
+    <w:p>
+      <w:pPr>
+        <w:ind w:left="709" w:hanging="283"/>
+        <w:spacing w:before="0" w:after="100" w:line="276" w:lineRule="auto"/>
+      </w:pPr>
+      <w:r>
+        <w:rPr>
+          <w:sz w:val="24"/>
+        </w:rPr>
+        <w:t>a deliberação prévia do Conselho Municipal de Ciência, Tecnologia e Inovação (COMCITI), em parecer exarado na data de ___/___/2026, e a manifestação da Procuradoria-Geral do Município quanto à adequação jurídica desta regulamentação;</w:t>
       </w:r>
     </w:p>
     <w:p>

</xml_diff>

<commit_message>
fix: remove seções Caminho B do decreto-unificado-rota-a.docx
Decreto Rota A estava incluindo as 6 seções do Caminho B (I-B a VI-B).
Script agora remove blocos dec-caminho da rota oposta antes de extrair.

Co-Authored-By: Claude Sonnet 4.6 <noreply@anthropic.com>
</commit_message>
<xml_diff>
--- a/public/pdfs/decreto-unificado-rota-a.docx
+++ b/public/pdfs/decreto-unificado-rota-a.docx
@@ -4798,639 +4798,6 @@
           <w:sz w:val="24"/>
         </w:rPr>
         <w:t>§ 2º A ausência de devolução no prazo do §1º sujeita o Proponente ao regime de sanções do Capítulo VII, hipótese em que o valor devido passará a ser corrigido nos termos das normas aplicáveis à dívida ativa municipal.</w:t>
-      </w:r>
-    </w:p>
-    <w:p>
-      <w:pPr>
-        <w:jc w:val="center"/>
-        <w:spacing w:before="160" w:after="80"/>
-      </w:pPr>
-      <w:r>
-        <w:rPr>
-          <w:b/>
-          <w:sz w:val="24"/>
-        </w:rPr>
-        <w:t>Seção I-B — Disposições do Caminho B</w:t>
-      </w:r>
-    </w:p>
-    <w:p>
-      <w:pPr>
-        <w:ind w:firstLine="709"/>
-        <w:jc w:val="both"/>
-        <w:spacing w:before="0" w:after="120" w:line="276" w:lineRule="auto"/>
-      </w:pPr>
-      <w:r>
-        <w:rPr>
-          <w:sz w:val="24"/>
-        </w:rPr>
-        <w:t>Art. 33 No Caminho B, o Programa opera por meio de redirecionamento fiscal, consistente na destinação, por Contribuinte Incentivador, de parcela do ISSQN ou IPTU devido ao Município de Joinville, diretamente a Projeto de Inovação aprovado pelo Programa.</w:t>
-      </w:r>
-    </w:p>
-    <w:p>
-      <w:pPr>
-        <w:ind w:firstLine="709"/>
-        <w:jc w:val="both"/>
-        <w:spacing w:before="0" w:after="120" w:line="276" w:lineRule="auto"/>
-      </w:pPr>
-      <w:r>
-        <w:rPr>
-          <w:sz w:val="24"/>
-        </w:rPr>
-        <w:t>§ 1º O mecanismo previsto neste Capítulo somente produz efeitos após a entrada em vigor de Lei Complementar Municipal específica que o autorize, observados os requisitos de reserva legal tributária da Constituição Federal (art. 150, §6º), de responsabilidade fiscal (art. 14 da Lei Complementar nº 101, de 2000) e de legalidade tributária estrita.</w:t>
-      </w:r>
-    </w:p>
-    <w:p>
-      <w:pPr>
-        <w:ind w:firstLine="709"/>
-        <w:jc w:val="both"/>
-        <w:spacing w:before="0" w:after="120" w:line="276" w:lineRule="auto"/>
-      </w:pPr>
-      <w:r>
-        <w:rPr>
-          <w:sz w:val="24"/>
-        </w:rPr>
-        <w:t>§ 2º O recurso redirecionado não transita pela Tesouraria Municipal — é transferido diretamente pelo Contribuinte Incentivador à Conta Vinculada do Projeto (art. 37), após emissão do Certificado de Incentivo Fiscal (art. 36).</w:t>
-      </w:r>
-    </w:p>
-    <w:p>
-      <w:pPr>
-        <w:ind w:firstLine="709"/>
-        <w:jc w:val="both"/>
-        <w:spacing w:before="0" w:after="120" w:line="276" w:lineRule="auto"/>
-      </w:pPr>
-      <w:r>
-        <w:rPr>
-          <w:sz w:val="24"/>
-        </w:rPr>
-        <w:t>§ 3º O Contribuinte Incentivador paga o mesmo valor total de tributo devido — apenas muda-se o destino da parcela redirecionada. Não há benefício fiscal ao Contribuinte além do cumprimento da obrigação tributária com a destinação autorizada.</w:t>
-      </w:r>
-    </w:p>
-    <w:p>
-      <w:pPr>
-        <w:ind w:firstLine="709"/>
-        <w:jc w:val="both"/>
-        <w:spacing w:before="0" w:after="120" w:line="276" w:lineRule="auto"/>
-      </w:pPr>
-      <w:r>
-        <w:rPr>
-          <w:sz w:val="24"/>
-        </w:rPr>
-        <w:t>§ 4º O valor por Projeto observa o teto previsto no art. 32 (475 UPM).</w:t>
-      </w:r>
-    </w:p>
-    <w:p>
-      <w:pPr>
-        <w:jc w:val="center"/>
-        <w:spacing w:before="160" w:after="80"/>
-      </w:pPr>
-      <w:r>
-        <w:rPr>
-          <w:b/>
-          <w:sz w:val="24"/>
-        </w:rPr>
-        <w:t>Seção II-B — Da Carta de Captação</w:t>
-      </w:r>
-    </w:p>
-    <w:p>
-      <w:pPr>
-        <w:ind w:firstLine="709"/>
-        <w:jc w:val="both"/>
-        <w:spacing w:before="0" w:after="120" w:line="276" w:lineRule="auto"/>
-      </w:pPr>
-      <w:r>
-        <w:rPr>
-          <w:sz w:val="24"/>
-        </w:rPr>
-        <w:t>Art. 34 A Carta de Captação é o ato formal emitido pela SDE em favor do Proponente selecionado, após homologação pelo Comitê Decisório, habilitando-o a captar recursos junto a Contribuintes Incentivadores nos termos deste Decreto e da Lei Complementar autorizativa.</w:t>
-      </w:r>
-    </w:p>
-    <w:p>
-      <w:pPr>
-        <w:ind w:firstLine="709"/>
-        <w:jc w:val="both"/>
-        <w:spacing w:before="0" w:after="120" w:line="276" w:lineRule="auto"/>
-      </w:pPr>
-      <w:r>
-        <w:rPr>
-          <w:sz w:val="24"/>
-        </w:rPr>
-        <w:t>§ 1º A Carta de Captação contém: identificação do Proponente, objeto e metas do Projeto, valor total autorizado à captação, prazo de validade e referência ao número do ciclo.</w:t>
-      </w:r>
-    </w:p>
-    <w:p>
-      <w:pPr>
-        <w:ind w:firstLine="709"/>
-        <w:jc w:val="both"/>
-        <w:spacing w:before="0" w:after="120" w:line="276" w:lineRule="auto"/>
-      </w:pPr>
-      <w:r>
-        <w:rPr>
-          <w:sz w:val="24"/>
-        </w:rPr>
-        <w:t>§ 2º A validade da Carta de Captação é de 1 (um) ano, contado da data de sua emissão.</w:t>
-      </w:r>
-    </w:p>
-    <w:p>
-      <w:pPr>
-        <w:ind w:firstLine="709"/>
-        <w:jc w:val="both"/>
-        <w:spacing w:before="0" w:after="120" w:line="276" w:lineRule="auto"/>
-      </w:pPr>
-      <w:r>
-        <w:rPr>
-          <w:sz w:val="24"/>
-        </w:rPr>
-        <w:t>§ 3º Admite-se 1 (uma) prorrogação única de até 6 (seis) meses, mediante requerimento fundamentado do Proponente à SDE, apresentado antes do término da validade original.</w:t>
-      </w:r>
-    </w:p>
-    <w:p>
-      <w:pPr>
-        <w:ind w:firstLine="709"/>
-        <w:jc w:val="both"/>
-        <w:spacing w:before="0" w:after="120" w:line="276" w:lineRule="auto"/>
-      </w:pPr>
-      <w:r>
-        <w:rPr>
-          <w:sz w:val="24"/>
-        </w:rPr>
-        <w:t>§ 4º O Proponente tem o dever de buscar ativamente os Contribuintes Incentivadores, sendo a captação atividade do próprio Proponente e não da Administração Municipal.</w:t>
-      </w:r>
-    </w:p>
-    <w:p>
-      <w:pPr>
-        <w:jc w:val="center"/>
-        <w:spacing w:before="160" w:after="80"/>
-      </w:pPr>
-      <w:r>
-        <w:rPr>
-          <w:b/>
-          <w:sz w:val="24"/>
-        </w:rPr>
-        <w:t>Seção III-B — Do Contribuinte Incentivador</w:t>
-      </w:r>
-    </w:p>
-    <w:p>
-      <w:pPr>
-        <w:ind w:firstLine="709"/>
-        <w:jc w:val="both"/>
-        <w:spacing w:before="0" w:after="120" w:line="276" w:lineRule="auto"/>
-      </w:pPr>
-      <w:r>
-        <w:rPr>
-          <w:sz w:val="24"/>
-        </w:rPr>
-        <w:t>Art. 35 Poderá figurar como Contribuinte Incentivador, aderindo voluntariamente ao mecanismo de redirecionamento fiscal:</w:t>
-      </w:r>
-    </w:p>
-    <w:p>
-      <w:pPr>
-        <w:ind w:left="850"/>
-        <w:spacing w:before="0" w:after="60" w:line="276" w:lineRule="auto"/>
-      </w:pPr>
-      <w:r>
-        <w:rPr>
-          <w:sz w:val="24"/>
-        </w:rPr>
-        <w:t>pessoa física contribuinte do IPTU no Município de Joinville;</w:t>
-      </w:r>
-    </w:p>
-    <w:p>
-      <w:pPr>
-        <w:ind w:left="850"/>
-        <w:spacing w:before="0" w:after="60" w:line="276" w:lineRule="auto"/>
-      </w:pPr>
-      <w:r>
-        <w:rPr>
-          <w:sz w:val="24"/>
-        </w:rPr>
-        <w:t>pessoa jurídica contribuinte do ISSQN no Município de Joinville;</w:t>
-      </w:r>
-    </w:p>
-    <w:p>
-      <w:pPr>
-        <w:ind w:left="850"/>
-        <w:spacing w:before="0" w:after="60" w:line="276" w:lineRule="auto"/>
-      </w:pPr>
-      <w:r>
-        <w:rPr>
-          <w:sz w:val="24"/>
-        </w:rPr>
-        <w:t>pessoa jurídica proprietária de imóvel no Município e, portanto, contribuinte do IPTU.</w:t>
-      </w:r>
-    </w:p>
-    <w:p>
-      <w:pPr>
-        <w:ind w:firstLine="709"/>
-        <w:jc w:val="both"/>
-        <w:spacing w:before="0" w:after="120" w:line="276" w:lineRule="auto"/>
-      </w:pPr>
-      <w:r>
-        <w:rPr>
-          <w:sz w:val="24"/>
-        </w:rPr>
-        <w:t>§ 1º São requisitos para a adesão como Contribuinte Incentivador:</w:t>
-      </w:r>
-    </w:p>
-    <w:p>
-      <w:pPr>
-        <w:ind w:left="850"/>
-        <w:spacing w:before="0" w:after="60" w:line="276" w:lineRule="auto"/>
-      </w:pPr>
-      <w:r>
-        <w:rPr>
-          <w:sz w:val="24"/>
-        </w:rPr>
-        <w:t>regularidade fiscal junto ao Município de Joinville, ou existência de parcelamento em situação regular, comprovados por certidão;</w:t>
-      </w:r>
-    </w:p>
-    <w:p>
-      <w:pPr>
-        <w:ind w:left="850"/>
-        <w:spacing w:before="0" w:after="60" w:line="276" w:lineRule="auto"/>
-      </w:pPr>
-      <w:r>
-        <w:rPr>
-          <w:sz w:val="24"/>
-        </w:rPr>
-        <w:t>adesão formal, por instrumento a ser definido em ato da SDE, contendo a indicação do Projeto a ser apoiado, o valor a ser redirecionado e a declaração de ciência e concordância com as regras deste Decreto e da Lei Complementar autorizativa;</w:t>
-      </w:r>
-    </w:p>
-    <w:p>
-      <w:pPr>
-        <w:ind w:left="850"/>
-        <w:spacing w:before="0" w:after="60" w:line="276" w:lineRule="auto"/>
-      </w:pPr>
-      <w:r>
-        <w:rPr>
-          <w:sz w:val="24"/>
-        </w:rPr>
-        <w:t>comprovação da capacidade tributária — não é possível redirecionar valor superior ao ISSQN ou IPTU efetivamente devido pelo Contribuinte no exercício.</w:t>
-      </w:r>
-    </w:p>
-    <w:p>
-      <w:pPr>
-        <w:ind w:firstLine="709"/>
-        <w:jc w:val="both"/>
-        <w:spacing w:before="0" w:after="120" w:line="276" w:lineRule="auto"/>
-      </w:pPr>
-      <w:r>
-        <w:rPr>
-          <w:sz w:val="24"/>
-        </w:rPr>
-        <w:t>§ 2º Não há limite percentual por Contribuinte Incentivador — o Contribuinte pode destinar, por sua própria decisão, até 100% (cem por cento) do ISSQN ou do IPTU por ele devido no exercício, observado o teto por Projeto (art. 32) e o teto anual do Programa (art. 37).</w:t>
-      </w:r>
-    </w:p>
-    <w:p>
-      <w:pPr>
-        <w:ind w:firstLine="709"/>
-        <w:jc w:val="both"/>
-        <w:spacing w:before="0" w:after="120" w:line="276" w:lineRule="auto"/>
-      </w:pPr>
-      <w:r>
-        <w:rPr>
-          <w:sz w:val="24"/>
-        </w:rPr>
-        <w:t>§ 3º Um mesmo Contribuinte Incentivador pode apoiar mais de um Projeto no mesmo exercício, respeitados os limites do §2º.</w:t>
-      </w:r>
-    </w:p>
-    <w:p>
-      <w:pPr>
-        <w:ind w:firstLine="709"/>
-        <w:jc w:val="both"/>
-        <w:spacing w:before="0" w:after="120" w:line="276" w:lineRule="auto"/>
-      </w:pPr>
-      <w:r>
-        <w:rPr>
-          <w:sz w:val="24"/>
-        </w:rPr>
-        <w:t>§ 4º São vedadas como Contribuinte Incentivador:</w:t>
-      </w:r>
-    </w:p>
-    <w:p>
-      <w:pPr>
-        <w:ind w:left="850"/>
-        <w:spacing w:before="0" w:after="60" w:line="276" w:lineRule="auto"/>
-      </w:pPr>
-      <w:r>
-        <w:rPr>
-          <w:sz w:val="24"/>
-        </w:rPr>
-        <w:t>pessoa com qualquer vínculo societário, familiar até o 3º grau ou de controle com o Proponente do Projeto apoiado, salvo em hipótese excepcional, com parecer favorável da PGM;</w:t>
-      </w:r>
-    </w:p>
-    <w:p>
-      <w:pPr>
-        <w:ind w:left="850"/>
-        <w:spacing w:before="0" w:after="60" w:line="276" w:lineRule="auto"/>
-      </w:pPr>
-      <w:r>
-        <w:rPr>
-          <w:sz w:val="24"/>
-        </w:rPr>
-        <w:t>pessoa declarada inidônea para contratar com a Administração Pública, enquanto perdurarem os efeitos da sanção;</w:t>
-      </w:r>
-    </w:p>
-    <w:p>
-      <w:pPr>
-        <w:ind w:left="850"/>
-        <w:spacing w:before="0" w:after="60" w:line="276" w:lineRule="auto"/>
-      </w:pPr>
-      <w:r>
-        <w:rPr>
-          <w:sz w:val="24"/>
-        </w:rPr>
-        <w:t>pessoa com dívida tributária em execução fiscal no Município, sem parcelamento regular.</w:t>
-      </w:r>
-    </w:p>
-    <w:p>
-      <w:pPr>
-        <w:jc w:val="center"/>
-        <w:spacing w:before="160" w:after="80"/>
-      </w:pPr>
-      <w:r>
-        <w:rPr>
-          <w:b/>
-          <w:sz w:val="24"/>
-        </w:rPr>
-        <w:t>Seção IV-B — Do Certificado de Incentivo Fiscal</w:t>
-      </w:r>
-    </w:p>
-    <w:p>
-      <w:pPr>
-        <w:ind w:firstLine="709"/>
-        <w:jc w:val="both"/>
-        <w:spacing w:before="0" w:after="120" w:line="276" w:lineRule="auto"/>
-      </w:pPr>
-      <w:r>
-        <w:rPr>
-          <w:sz w:val="24"/>
-        </w:rPr>
-        <w:t>Art. 36 O Certificado de Incentivo Fiscal é o documento emitido pelo Município ao Contribuinte Incentivador que comprova o depósito em favor do Projeto e autoriza o abatimento correspondente no ISSQN ou IPTU devido.</w:t>
-      </w:r>
-    </w:p>
-    <w:p>
-      <w:pPr>
-        <w:ind w:firstLine="709"/>
-        <w:jc w:val="both"/>
-        <w:spacing w:before="0" w:after="120" w:line="276" w:lineRule="auto"/>
-      </w:pPr>
-      <w:r>
-        <w:rPr>
-          <w:sz w:val="24"/>
-        </w:rPr>
-        <w:t>§ 1º O fluxo operacional é o seguinte:</w:t>
-      </w:r>
-    </w:p>
-    <w:p>
-      <w:pPr>
-        <w:ind w:left="850"/>
-        <w:spacing w:before="0" w:after="60" w:line="276" w:lineRule="auto"/>
-      </w:pPr>
-      <w:r>
-        <w:rPr>
-          <w:sz w:val="24"/>
-        </w:rPr>
-        <w:t>Proponente com Carta de Captação apresenta Contribuinte Incentivador à SDE, com instrumento de adesão;</w:t>
-      </w:r>
-    </w:p>
-    <w:p>
-      <w:pPr>
-        <w:ind w:left="850"/>
-        <w:spacing w:before="0" w:after="60" w:line="276" w:lineRule="auto"/>
-      </w:pPr>
-      <w:r>
-        <w:rPr>
-          <w:sz w:val="24"/>
-        </w:rPr>
-        <w:t>SDE valida os requisitos do Contribuinte (art. 35, §1º) e os valores em face do teto do Projeto (art. 32) e do teto anual (art. 37);</w:t>
-      </w:r>
-    </w:p>
-    <w:p>
-      <w:pPr>
-        <w:ind w:left="850"/>
-        <w:spacing w:before="0" w:after="60" w:line="276" w:lineRule="auto"/>
-      </w:pPr>
-      <w:r>
-        <w:rPr>
-          <w:sz w:val="24"/>
-        </w:rPr>
-        <w:t>Contribuinte efetua o depósito na Conta Vinculada do Projeto;</w:t>
-      </w:r>
-    </w:p>
-    <w:p>
-      <w:pPr>
-        <w:ind w:left="850"/>
-        <w:spacing w:before="0" w:after="60" w:line="276" w:lineRule="auto"/>
-      </w:pPr>
-      <w:r>
-        <w:rPr>
-          <w:sz w:val="24"/>
-        </w:rPr>
-        <w:t>Comprovado o depósito, o Município emite o Certificado de Incentivo Fiscal;</w:t>
-      </w:r>
-    </w:p>
-    <w:p>
-      <w:pPr>
-        <w:ind w:left="850"/>
-        <w:spacing w:before="0" w:after="60" w:line="276" w:lineRule="auto"/>
-      </w:pPr>
-      <w:r>
-        <w:rPr>
-          <w:sz w:val="24"/>
-        </w:rPr>
-        <w:t>O Certificado é utilizado pelo Contribuinte para abatimento do ISSQN ou IPTU devido, nos termos da Lei Complementar autorizativa.</w:t>
-      </w:r>
-    </w:p>
-    <w:p>
-      <w:pPr>
-        <w:ind w:firstLine="709"/>
-        <w:jc w:val="both"/>
-        <w:spacing w:before="0" w:after="120" w:line="276" w:lineRule="auto"/>
-      </w:pPr>
-      <w:r>
-        <w:rPr>
-          <w:sz w:val="24"/>
-        </w:rPr>
-        <w:t>§ 2º A emissão do Certificado observa os prazos e o procedimento a serem detalhados em regulamento específico da SEFAZ, em articulação com a SDE.</w:t>
-      </w:r>
-    </w:p>
-    <w:p>
-      <w:pPr>
-        <w:ind w:firstLine="709"/>
-        <w:jc w:val="both"/>
-        <w:spacing w:before="0" w:after="120" w:line="276" w:lineRule="auto"/>
-      </w:pPr>
-      <w:r>
-        <w:rPr>
-          <w:sz w:val="24"/>
-        </w:rPr>
-        <w:t>§ 3º É vedada a emissão de Certificado antes da efetiva comprovação do depósito na Conta Vinculada.</w:t>
-      </w:r>
-    </w:p>
-    <w:p>
-      <w:pPr>
-        <w:jc w:val="center"/>
-        <w:spacing w:before="160" w:after="80"/>
-      </w:pPr>
-      <w:r>
-        <w:rPr>
-          <w:b/>
-          <w:sz w:val="24"/>
-        </w:rPr>
-        <w:t>Seção V-B — Da Conta Vinculada, captação mínima e teto anual</w:t>
-      </w:r>
-    </w:p>
-    <w:p>
-      <w:pPr>
-        <w:ind w:firstLine="709"/>
-        <w:jc w:val="both"/>
-        <w:spacing w:before="0" w:after="120" w:line="276" w:lineRule="auto"/>
-      </w:pPr>
-      <w:r>
-        <w:rPr>
-          <w:sz w:val="24"/>
-        </w:rPr>
-        <w:t>Art. 37 A execução financeira do Projeto no Caminho B se dá por meio de Conta Vinculada do Projeto, aberta em nome do Proponente em instituição financeira oficial, exclusivamente destinada à recepção dos valores redirecionados por Contribuintes Incentivadores e ao pagamento das despesas do Projeto.</w:t>
-      </w:r>
-    </w:p>
-    <w:p>
-      <w:pPr>
-        <w:ind w:firstLine="709"/>
-        <w:jc w:val="both"/>
-        <w:spacing w:before="0" w:after="120" w:line="276" w:lineRule="auto"/>
-      </w:pPr>
-      <w:r>
-        <w:rPr>
-          <w:sz w:val="24"/>
-        </w:rPr>
-        <w:t>§ 1º Aplicam-se à Conta Vinculada, no Caminho B, as mesmas regras de operação previstas no art. 36 do Caminho A (nexo de causalidade, vedação de saque em espécie, autonomia do Proponente dentro do objeto, aplicação obrigatória dos rendimentos financeiros no próprio Projeto).</w:t>
-      </w:r>
-    </w:p>
-    <w:p>
-      <w:pPr>
-        <w:ind w:firstLine="709"/>
-        <w:jc w:val="both"/>
-        <w:spacing w:before="0" w:after="120" w:line="276" w:lineRule="auto"/>
-      </w:pPr>
-      <w:r>
-        <w:rPr>
-          <w:sz w:val="24"/>
-        </w:rPr>
-        <w:t>§ 2º A captação mínima para início da execução do Projeto é de 10% (dez por cento) do valor total aprovado na Carta de Captação, a ser integralizada na Conta Vinculada dentro do prazo de validade da Carta.</w:t>
-      </w:r>
-    </w:p>
-    <w:p>
-      <w:pPr>
-        <w:ind w:firstLine="709"/>
-        <w:jc w:val="both"/>
-        <w:spacing w:before="0" w:after="120" w:line="276" w:lineRule="auto"/>
-      </w:pPr>
-      <w:r>
-        <w:rPr>
-          <w:sz w:val="24"/>
-        </w:rPr>
-        <w:t>§ 3º Projeto que não atingir a captação mínima no prazo da Carta, mesmo com a prorrogação prevista no art. 34, §3º, é considerado não executado por impossibilidade de captação, sem caracterização de inadimplemento e sem prejuízo da possibilidade de nova submissão em ciclos futuros.</w:t>
-      </w:r>
-    </w:p>
-    <w:p>
-      <w:pPr>
-        <w:ind w:firstLine="709"/>
-        <w:jc w:val="both"/>
-        <w:spacing w:before="0" w:after="120" w:line="276" w:lineRule="auto"/>
-      </w:pPr>
-      <w:r>
-        <w:rPr>
-          <w:sz w:val="24"/>
-        </w:rPr>
-        <w:t>§ 4º O teto anual do Programa no Caminho B — valor máximo de redirecionamento fiscal autorizado no conjunto dos Projetos em cada exercício — será fixado pela Lei Complementar autorizativa, observada a compatibilidade com a Lei de Diretrizes Orçamentárias e a Lei Orçamentária Anual do Município, e demonstrada em nota técnica da SEFAZ (LRF, art. 14). [Decisão da PMJ — a definir na redação da LC]</w:t>
-      </w:r>
-    </w:p>
-    <w:p>
-      <w:pPr>
-        <w:ind w:firstLine="709"/>
-        <w:jc w:val="both"/>
-        <w:spacing w:before="0" w:after="120" w:line="276" w:lineRule="auto"/>
-      </w:pPr>
-      <w:r>
-        <w:rPr>
-          <w:sz w:val="24"/>
-        </w:rPr>
-        <w:t>§ 5º Atingido o teto anual do Programa, novas captações serão suspensas até o exercício seguinte, mantidas as captações já realizadas e os Projetos em execução.</w:t>
-      </w:r>
-    </w:p>
-    <w:p>
-      <w:pPr>
-        <w:jc w:val="center"/>
-        <w:spacing w:before="160" w:after="80"/>
-      </w:pPr>
-      <w:r>
-        <w:rPr>
-          <w:b/>
-          <w:sz w:val="24"/>
-        </w:rPr>
-        <w:t>Seção VI-B — Do saldo não captado e do saldo não executado</w:t>
-      </w:r>
-    </w:p>
-    <w:p>
-      <w:pPr>
-        <w:ind w:firstLine="709"/>
-        <w:jc w:val="both"/>
-        <w:spacing w:before="0" w:after="120" w:line="276" w:lineRule="auto"/>
-      </w:pPr>
-      <w:r>
-        <w:rPr>
-          <w:sz w:val="24"/>
-        </w:rPr>
-        <w:t>Art. 38 Encerrado o prazo de validade da Carta de Captação (incluída a prorrogação do art. 34, §3º), aplicam-se as seguintes regras:</w:t>
-      </w:r>
-    </w:p>
-    <w:p>
-      <w:pPr>
-        <w:ind w:left="850"/>
-        <w:spacing w:before="0" w:after="60" w:line="276" w:lineRule="auto"/>
-      </w:pPr>
-      <w:r>
-        <w:rPr>
-          <w:sz w:val="24"/>
-        </w:rPr>
-        <w:t>a parcela não captada junto a Contribuintes Incentivadores fica automaticamente indisponível, sem prejuízo para o Município;</w:t>
-      </w:r>
-    </w:p>
-    <w:p>
-      <w:pPr>
-        <w:ind w:left="850"/>
-        <w:spacing w:before="0" w:after="60" w:line="276" w:lineRule="auto"/>
-      </w:pPr>
-      <w:r>
-        <w:rPr>
-          <w:sz w:val="24"/>
-        </w:rPr>
-        <w:t>a parcela captada e não executada na Conta Vinculada é devolvida ao FIT/Jlle pelo seu valor nominal, no prazo de 30 (trinta) dias contados da aprovação da prestação de contas final, sem correção monetária ou juros, nos mesmos termos do art. 38 do Caminho A;</w:t>
-      </w:r>
-    </w:p>
-    <w:p>
-      <w:pPr>
-        <w:ind w:left="850"/>
-        <w:spacing w:before="0" w:after="60" w:line="276" w:lineRule="auto"/>
-      </w:pPr>
-      <w:r>
-        <w:rPr>
-          <w:sz w:val="24"/>
-        </w:rPr>
-        <w:t>a ausência de devolução no prazo sujeita o Proponente ao regime de sanções do Capítulo VII, hipótese em que o valor passará a ser corrigido nos termos das normas da dívida ativa municipal.</w:t>
-      </w:r>
-    </w:p>
-    <w:p>
-      <w:pPr>
-        <w:ind w:firstLine="709"/>
-        <w:jc w:val="both"/>
-        <w:spacing w:before="0" w:after="120" w:line="276" w:lineRule="auto"/>
-      </w:pPr>
-      <w:r>
-        <w:rPr>
-          <w:sz w:val="24"/>
-        </w:rPr>
-        <w:t>Parágrafo único. O Certificado de Incentivo Fiscal emitido em favor do Contribuinte Incentivador permanece válido ainda que o Projeto não seja integralmente executado, desde que o depósito original tenha sido efetivado regularmente — o Contribuinte cumpriu sua obrigação no ato do redirecionamento.</w:t>
       </w:r>
     </w:p>
     <w:p>

</xml_diff>